<commit_message>
fix: marcar nombre del tutor en rojo en portada del .docx
</commit_message>
<xml_diff>
--- a/Entregables/Memoria-TFG-Liher-Rios.docx
+++ b/Entregables/Memoria-TFG-Liher-Rios.docx
@@ -100,11 +100,12 @@
       <w:r>
         <w:rPr>
           <w:rFonts w:ascii="Arial" w:hAnsi="Arial"/>
-          <w:b w:val="0"/>
-          <w:i w:val="0"/>
-          <w:sz w:val="24"/>
-        </w:rPr>
-        <w:t>Tutor: [Nombre del tutor]</w:t>
+          <w:b/>
+          <w:i w:val="0"/>
+          <w:color w:val="FF0000"/>
+          <w:sz w:val="24"/>
+        </w:rPr>
+        <w:t>Tutor: *** RELLENAR NOMBRE DEL TUTOR ***</w:t>
       </w:r>
     </w:p>
     <w:p>

</xml_diff>